<commit_message>
Updates to AI Scale levels
</commit_message>
<xml_diff>
--- a/Course Materials/AI Scale Levels and Descriptions.docx
+++ b/Course Materials/AI Scale Levels and Descriptions.docx
@@ -1,6 +1,6 @@
 
 <file path=word/document.xml><?xml version="1.0" encoding="utf-8"?>
-<w:document xmlns:wpc="http://schemas.microsoft.com/office/word/2010/wordprocessingCanvas" xmlns:cx="http://schemas.microsoft.com/office/drawing/2014/chartex" xmlns:cx1="http://schemas.microsoft.com/office/drawing/2015/9/8/chartex" xmlns:cx2="http://schemas.microsoft.com/office/drawing/2015/10/21/chartex" xmlns:cx3="http://schemas.microsoft.com/office/drawing/2016/5/9/chartex" xmlns:cx4="http://schemas.microsoft.com/office/drawing/2016/5/10/chartex" xmlns:cx5="http://schemas.microsoft.com/office/drawing/2016/5/11/chartex" xmlns:cx6="http://schemas.microsoft.com/office/drawing/2016/5/12/chartex" xmlns:cx7="http://schemas.microsoft.com/office/drawing/2016/5/13/chartex" xmlns:cx8="http://schemas.microsoft.com/office/drawing/2016/5/14/chartex" xmlns:mc="http://schemas.openxmlformats.org/markup-compatibility/2006" xmlns:aink="http://schemas.microsoft.com/office/drawing/2016/ink" xmlns:am3d="http://schemas.microsoft.com/office/drawing/2017/model3d" xmlns:o="urn:schemas-microsoft-com:office:office" xmlns:oel="http://schemas.microsoft.com/office/2019/extlst" xmlns:r="http://schemas.openxmlformats.org/officeDocument/2006/relationships" xmlns:m="http://schemas.openxmlformats.org/officeDocument/2006/math" xmlns:v="urn:schemas-microsoft-com:vml" xmlns:wp14="http://schemas.microsoft.com/office/word/2010/wordprocessingDrawing" xmlns:wp="http://schemas.openxmlformats.org/drawingml/2006/wordprocessingDrawing" xmlns:w10="urn:schemas-microsoft-com:office:word" xmlns:w="http://schemas.openxmlformats.org/wordprocessingml/2006/main" xmlns:w14="http://schemas.microsoft.com/office/word/2010/wordml" xmlns:w15="http://schemas.microsoft.com/office/word/2012/wordml" xmlns:w16cex="http://schemas.microsoft.com/office/word/2018/wordml/cex" xmlns:w16cid="http://schemas.microsoft.com/office/word/2016/wordml/cid" xmlns:w16="http://schemas.microsoft.com/office/word/2018/wordml" xmlns:w16du="http://schemas.microsoft.com/office/word/2023/wordml/word16du" xmlns:w16sdtdh="http://schemas.microsoft.com/office/word/2020/wordml/sdtdatahash" xmlns:w16sdtfl="http://schemas.microsoft.com/office/word/2024/wordml/sdtformatlock" xmlns:w16se="http://schemas.microsoft.com/office/word/2015/wordml/symex" xmlns:wpg="http://schemas.microsoft.com/office/word/2010/wordprocessingGroup" xmlns:wpi="http://schemas.microsoft.com/office/word/2010/wordprocessingInk" xmlns:wne="http://schemas.microsoft.com/office/word/2006/wordml" xmlns:wps="http://schemas.microsoft.com/office/word/2010/wordprocessingShape" mc:Ignorable="w14 w15 w16se w16cid w16 w16cex w16sdtdh w16sdtfl w16du wp14">
+<w:document xmlns:wpc="http://schemas.microsoft.com/office/word/2010/wordprocessingCanvas" xmlns:cx="http://schemas.microsoft.com/office/drawing/2014/chartex" xmlns:cx1="http://schemas.microsoft.com/office/drawing/2015/9/8/chartex" xmlns:cx2="http://schemas.microsoft.com/office/drawing/2015/10/21/chartex" xmlns:cx3="http://schemas.microsoft.com/office/drawing/2016/5/9/chartex" xmlns:cx4="http://schemas.microsoft.com/office/drawing/2016/5/10/chartex" xmlns:cx5="http://schemas.microsoft.com/office/drawing/2016/5/11/chartex" xmlns:cx6="http://schemas.microsoft.com/office/drawing/2016/5/12/chartex" xmlns:cx7="http://schemas.microsoft.com/office/drawing/2016/5/13/chartex" xmlns:cx8="http://schemas.microsoft.com/office/drawing/2016/5/14/chartex" xmlns:mc="http://schemas.openxmlformats.org/markup-compatibility/2006" xmlns:aink="http://schemas.microsoft.com/office/drawing/2016/ink" xmlns:am3d="http://schemas.microsoft.com/office/drawing/2017/model3d" xmlns:o="urn:schemas-microsoft-com:office:office" xmlns:oel="http://schemas.microsoft.com/office/2019/extlst" xmlns:r="http://schemas.openxmlformats.org/officeDocument/2006/relationships" xmlns:m="http://schemas.openxmlformats.org/officeDocument/2006/math" xmlns:v="urn:schemas-microsoft-com:vml" xmlns:wp14="http://schemas.microsoft.com/office/word/2010/wordprocessingDrawing" xmlns:wp="http://schemas.openxmlformats.org/drawingml/2006/wordprocessingDrawing" xmlns:w10="urn:schemas-microsoft-com:office:word" xmlns:w="http://schemas.openxmlformats.org/wordprocessingml/2006/main" xmlns:w14="http://schemas.microsoft.com/office/word/2010/wordml" xmlns:w15="http://schemas.microsoft.com/office/word/2012/wordml" xmlns:w16cex="http://schemas.microsoft.com/office/word/2018/wordml/cex" xmlns:w16cid="http://schemas.microsoft.com/office/word/2016/wordml/cid" xmlns:w16="http://schemas.microsoft.com/office/word/2018/wordml" xmlns:w16sdtdh="http://schemas.microsoft.com/office/word/2020/wordml/sdtdatahash" xmlns:w16se="http://schemas.microsoft.com/office/word/2015/wordml/symex" xmlns:wpg="http://schemas.microsoft.com/office/word/2010/wordprocessingGroup" xmlns:wpi="http://schemas.microsoft.com/office/word/2010/wordprocessingInk" xmlns:wne="http://schemas.microsoft.com/office/word/2006/wordml" xmlns:wps="http://schemas.microsoft.com/office/word/2010/wordprocessingShape" mc:Ignorable="w14 w15 w16se w16cid w16 w16cex w16sdtdh wp14">
   <w:body>
     <w:p>
       <w:pPr>
@@ -216,7 +216,7 @@
               <w:rPr>
                 <w:sz w:val="20"/>
               </w:rPr>
-              <w:t>assessment</w:t>
+              <w:t>assignment</w:t>
             </w:r>
             <w:r>
               <w:rPr>
@@ -307,177 +307,64 @@
               <w:rPr>
                 <w:sz w:val="20"/>
               </w:rPr>
-              <w:t>This level ensures that students rely solely on their knowledge, understanding, and skills.</w:t>
-            </w:r>
-          </w:p>
-          <w:p>
-            <w:pPr>
-              <w:pStyle w:val="TableParagraph"/>
-              <w:spacing w:before="41"/>
-              <w:ind w:left="662" w:right="296"/>
+              <w:t xml:space="preserve">This level ensures that </w:t>
+            </w:r>
+            <w:r>
+              <w:rPr>
+                <w:sz w:val="20"/>
+              </w:rPr>
+              <w:t>you</w:t>
+            </w:r>
+            <w:r>
+              <w:rPr>
+                <w:sz w:val="20"/>
+              </w:rPr>
+              <w:t xml:space="preserve"> </w:t>
+            </w:r>
+            <w:r>
+              <w:rPr>
+                <w:sz w:val="20"/>
+              </w:rPr>
+              <w:t>rely</w:t>
+            </w:r>
+            <w:r>
+              <w:rPr>
+                <w:sz w:val="20"/>
+              </w:rPr>
+              <w:t xml:space="preserve"> solely on </w:t>
+            </w:r>
+            <w:r>
+              <w:rPr>
+                <w:sz w:val="20"/>
+              </w:rPr>
+              <w:t>your</w:t>
+            </w:r>
+            <w:r>
+              <w:rPr>
+                <w:sz w:val="20"/>
+              </w:rPr>
+              <w:t xml:space="preserve"> knowledge, understanding, and skills.</w:t>
+            </w:r>
+          </w:p>
+          <w:p>
+            <w:pPr>
+              <w:pStyle w:val="TableParagraph"/>
+              <w:spacing w:before="196" w:line="276" w:lineRule="auto"/>
+              <w:ind w:left="671" w:right="296"/>
               <w:jc w:val="center"/>
               <w:rPr>
                 <w:b/>
-                <w:sz w:val="20"/>
-              </w:rPr>
-            </w:pPr>
-            <w:r>
-              <w:rPr>
-                <w:b/>
-                <w:sz w:val="20"/>
-              </w:rPr>
-              <w:t>AI</w:t>
-            </w:r>
-            <w:r>
-              <w:rPr>
-                <w:b/>
-                <w:spacing w:val="-5"/>
-                <w:sz w:val="20"/>
-              </w:rPr>
-              <w:t xml:space="preserve"> </w:t>
-            </w:r>
-            <w:r>
-              <w:rPr>
-                <w:b/>
-                <w:sz w:val="20"/>
-              </w:rPr>
-              <w:t>must</w:t>
-            </w:r>
-            <w:r>
-              <w:rPr>
-                <w:b/>
-                <w:spacing w:val="-4"/>
-                <w:sz w:val="20"/>
-              </w:rPr>
-              <w:t xml:space="preserve"> </w:t>
-            </w:r>
-            <w:r>
-              <w:rPr>
-                <w:b/>
-                <w:sz w:val="20"/>
-              </w:rPr>
-              <w:t>not</w:t>
-            </w:r>
-            <w:r>
-              <w:rPr>
-                <w:b/>
-                <w:spacing w:val="-4"/>
-                <w:sz w:val="20"/>
-              </w:rPr>
-              <w:t xml:space="preserve"> </w:t>
-            </w:r>
-            <w:r>
-              <w:rPr>
-                <w:b/>
-                <w:sz w:val="20"/>
-              </w:rPr>
-              <w:t>be</w:t>
-            </w:r>
-            <w:r>
-              <w:rPr>
-                <w:b/>
-                <w:spacing w:val="-4"/>
-                <w:sz w:val="20"/>
-              </w:rPr>
-              <w:t xml:space="preserve"> </w:t>
-            </w:r>
-            <w:r>
-              <w:rPr>
-                <w:b/>
-                <w:sz w:val="20"/>
-              </w:rPr>
-              <w:t>used</w:t>
-            </w:r>
-            <w:r>
-              <w:rPr>
-                <w:b/>
-                <w:spacing w:val="-5"/>
-                <w:sz w:val="20"/>
-              </w:rPr>
-              <w:t xml:space="preserve"> </w:t>
-            </w:r>
-            <w:r>
-              <w:rPr>
-                <w:b/>
-                <w:sz w:val="20"/>
-              </w:rPr>
-              <w:t>at</w:t>
-            </w:r>
-            <w:r>
-              <w:rPr>
-                <w:b/>
-                <w:spacing w:val="-3"/>
-                <w:sz w:val="20"/>
-              </w:rPr>
-              <w:t xml:space="preserve"> </w:t>
-            </w:r>
-            <w:r>
-              <w:rPr>
-                <w:b/>
-                <w:sz w:val="20"/>
-              </w:rPr>
-              <w:t>any</w:t>
-            </w:r>
-            <w:r>
-              <w:rPr>
-                <w:b/>
-                <w:spacing w:val="-4"/>
-                <w:sz w:val="20"/>
-              </w:rPr>
-              <w:t xml:space="preserve"> </w:t>
-            </w:r>
-            <w:r>
-              <w:rPr>
-                <w:b/>
-                <w:sz w:val="20"/>
-              </w:rPr>
-              <w:t>point</w:t>
-            </w:r>
-            <w:r>
-              <w:rPr>
-                <w:b/>
-                <w:spacing w:val="-3"/>
-                <w:sz w:val="20"/>
-              </w:rPr>
-              <w:t xml:space="preserve"> </w:t>
-            </w:r>
-            <w:r>
-              <w:rPr>
-                <w:b/>
-                <w:sz w:val="20"/>
-              </w:rPr>
-              <w:t>during</w:t>
-            </w:r>
-            <w:r>
-              <w:rPr>
-                <w:b/>
-                <w:spacing w:val="-3"/>
-                <w:sz w:val="20"/>
-              </w:rPr>
-              <w:t xml:space="preserve"> </w:t>
-            </w:r>
-            <w:r>
-              <w:rPr>
-                <w:b/>
-                <w:sz w:val="20"/>
-              </w:rPr>
-              <w:t>the</w:t>
-            </w:r>
-            <w:r>
-              <w:rPr>
-                <w:b/>
-                <w:spacing w:val="-5"/>
-                <w:sz w:val="20"/>
-              </w:rPr>
-              <w:t xml:space="preserve"> {</w:t>
-            </w:r>
-            <w:r>
-              <w:rPr>
-                <w:b/>
-                <w:spacing w:val="-2"/>
-                <w:sz w:val="20"/>
-              </w:rPr>
-              <w:t>class | assignment.}</w:t>
+                <w:bCs/>
+                <w:sz w:val="20"/>
+              </w:rPr>
+            </w:pPr>
+            <w:r>
+              <w:rPr>
+                <w:b/>
+                <w:bCs/>
+                <w:sz w:val="20"/>
+              </w:rPr>
+              <w:t>Copying and/or pasting AI responses without modification is considered plagiarism and may lead to disciplinarian actions including expulsion from class.</w:t>
             </w:r>
           </w:p>
         </w:tc>
@@ -548,6 +435,16 @@
           <w:p>
             <w:pPr>
               <w:pStyle w:val="TableParagraph"/>
+              <w:spacing w:before="105"/>
+              <w:rPr>
+                <w:b/>
+                <w:sz w:val="20"/>
+              </w:rPr>
+            </w:pPr>
+          </w:p>
+          <w:p>
+            <w:pPr>
+              <w:pStyle w:val="TableParagraph"/>
               <w:ind w:left="83" w:right="69" w:firstLine="3"/>
               <w:jc w:val="center"/>
               <w:rPr>
@@ -709,7 +606,7 @@
               <w:rPr>
                 <w:sz w:val="20"/>
               </w:rPr>
-              <w:t>assessment</w:t>
+              <w:t>assignment</w:t>
             </w:r>
             <w:r>
               <w:rPr>
@@ -748,7 +645,19 @@
               <w:rPr>
                 <w:sz w:val="20"/>
               </w:rPr>
-              <w:t>creating structures, and generating ideas for improving work.</w:t>
+              <w:t xml:space="preserve">creating structures, </w:t>
+            </w:r>
+            <w:r>
+              <w:rPr>
+                <w:sz w:val="20"/>
+              </w:rPr>
+              <w:t xml:space="preserve">studying concepts, </w:t>
+            </w:r>
+            <w:r>
+              <w:rPr>
+                <w:sz w:val="20"/>
+              </w:rPr>
+              <w:t>and generating ideas for improving work.</w:t>
             </w:r>
           </w:p>
           <w:p>
@@ -762,275 +671,32 @@
                 <w:sz w:val="20"/>
               </w:rPr>
             </w:pPr>
-            <w:r>
-              <w:rPr>
-                <w:b/>
-                <w:sz w:val="20"/>
-              </w:rPr>
-              <w:t>No</w:t>
-            </w:r>
-            <w:r>
-              <w:rPr>
-                <w:b/>
-                <w:spacing w:val="-4"/>
-                <w:sz w:val="20"/>
-              </w:rPr>
-              <w:t xml:space="preserve"> </w:t>
-            </w:r>
-            <w:r>
-              <w:rPr>
-                <w:b/>
-                <w:sz w:val="20"/>
-              </w:rPr>
-              <w:t>AI</w:t>
-            </w:r>
-            <w:r>
-              <w:rPr>
-                <w:b/>
-                <w:spacing w:val="-5"/>
-                <w:sz w:val="20"/>
-              </w:rPr>
-              <w:t xml:space="preserve"> </w:t>
-            </w:r>
-            <w:r>
-              <w:rPr>
-                <w:b/>
-                <w:sz w:val="20"/>
-              </w:rPr>
-              <w:t>content</w:t>
-            </w:r>
-            <w:r>
-              <w:rPr>
-                <w:b/>
-                <w:spacing w:val="-4"/>
-                <w:sz w:val="20"/>
-              </w:rPr>
-              <w:t xml:space="preserve"> </w:t>
-            </w:r>
-            <w:r>
-              <w:rPr>
-                <w:b/>
-                <w:sz w:val="20"/>
-              </w:rPr>
-              <w:t>is</w:t>
-            </w:r>
-            <w:r>
-              <w:rPr>
-                <w:b/>
-                <w:spacing w:val="-4"/>
-                <w:sz w:val="20"/>
-              </w:rPr>
-              <w:t xml:space="preserve"> </w:t>
-            </w:r>
-            <w:r>
-              <w:rPr>
-                <w:b/>
-                <w:sz w:val="20"/>
-              </w:rPr>
-              <w:t>allowed</w:t>
-            </w:r>
-            <w:r>
-              <w:rPr>
-                <w:b/>
-                <w:spacing w:val="-5"/>
-                <w:sz w:val="20"/>
-              </w:rPr>
-              <w:t xml:space="preserve"> </w:t>
-            </w:r>
-            <w:r>
-              <w:rPr>
-                <w:b/>
-                <w:sz w:val="20"/>
-              </w:rPr>
-              <w:t>in</w:t>
-            </w:r>
-            <w:r>
-              <w:rPr>
-                <w:b/>
-                <w:spacing w:val="-4"/>
-                <w:sz w:val="20"/>
-              </w:rPr>
-              <w:t xml:space="preserve"> </w:t>
-            </w:r>
-            <w:r>
-              <w:rPr>
-                <w:b/>
-                <w:sz w:val="20"/>
-              </w:rPr>
-              <w:t>the</w:t>
-            </w:r>
-            <w:r>
-              <w:rPr>
-                <w:b/>
-                <w:spacing w:val="-4"/>
-                <w:sz w:val="20"/>
-              </w:rPr>
-              <w:t xml:space="preserve"> </w:t>
-            </w:r>
-            <w:r>
-              <w:rPr>
-                <w:b/>
-                <w:sz w:val="20"/>
-              </w:rPr>
-              <w:t>AI</w:t>
-            </w:r>
-            <w:r>
-              <w:rPr>
-                <w:b/>
-                <w:spacing w:val="-5"/>
-                <w:sz w:val="20"/>
-              </w:rPr>
-              <w:t xml:space="preserve"> </w:t>
-            </w:r>
-            <w:r>
-              <w:rPr>
-                <w:b/>
-                <w:sz w:val="20"/>
-              </w:rPr>
-              <w:t>must</w:t>
-            </w:r>
-            <w:r>
-              <w:rPr>
-                <w:b/>
-                <w:spacing w:val="-4"/>
-                <w:sz w:val="20"/>
-              </w:rPr>
-              <w:t xml:space="preserve"> </w:t>
-            </w:r>
-            <w:r>
-              <w:rPr>
-                <w:b/>
-                <w:sz w:val="20"/>
-              </w:rPr>
-              <w:t>not</w:t>
-            </w:r>
-            <w:r>
-              <w:rPr>
-                <w:b/>
-                <w:spacing w:val="-4"/>
-                <w:sz w:val="20"/>
-              </w:rPr>
-              <w:t xml:space="preserve"> </w:t>
-            </w:r>
-            <w:r>
-              <w:rPr>
-                <w:b/>
-                <w:sz w:val="20"/>
-              </w:rPr>
-              <w:t>be</w:t>
-            </w:r>
-            <w:r>
-              <w:rPr>
-                <w:b/>
-                <w:spacing w:val="-4"/>
-                <w:sz w:val="20"/>
-              </w:rPr>
-              <w:t xml:space="preserve"> </w:t>
-            </w:r>
-            <w:r>
-              <w:rPr>
-                <w:b/>
-                <w:sz w:val="20"/>
-              </w:rPr>
-              <w:t>used</w:t>
-            </w:r>
-            <w:r>
-              <w:rPr>
-                <w:b/>
-                <w:spacing w:val="-5"/>
-                <w:sz w:val="20"/>
-              </w:rPr>
-              <w:t xml:space="preserve"> </w:t>
-            </w:r>
-            <w:r>
-              <w:rPr>
-                <w:b/>
-                <w:sz w:val="20"/>
-              </w:rPr>
-              <w:t>at</w:t>
-            </w:r>
-            <w:r>
-              <w:rPr>
-                <w:b/>
-                <w:spacing w:val="-3"/>
-                <w:sz w:val="20"/>
-              </w:rPr>
-              <w:t xml:space="preserve"> </w:t>
-            </w:r>
-            <w:r>
-              <w:rPr>
-                <w:b/>
-                <w:sz w:val="20"/>
-              </w:rPr>
-              <w:t>any</w:t>
-            </w:r>
-            <w:r>
-              <w:rPr>
-                <w:b/>
-                <w:spacing w:val="-4"/>
-                <w:sz w:val="20"/>
-              </w:rPr>
-              <w:t xml:space="preserve"> </w:t>
-            </w:r>
-            <w:r>
-              <w:rPr>
-                <w:b/>
-                <w:sz w:val="20"/>
-              </w:rPr>
-              <w:t>point</w:t>
-            </w:r>
-            <w:r>
-              <w:rPr>
-                <w:b/>
-                <w:spacing w:val="-3"/>
-                <w:sz w:val="20"/>
-              </w:rPr>
-              <w:t xml:space="preserve"> </w:t>
-            </w:r>
-            <w:r>
-              <w:rPr>
-                <w:b/>
-                <w:sz w:val="20"/>
-              </w:rPr>
-              <w:t>during</w:t>
-            </w:r>
-            <w:r>
-              <w:rPr>
-                <w:b/>
-                <w:spacing w:val="-3"/>
-                <w:sz w:val="20"/>
-              </w:rPr>
-              <w:t xml:space="preserve"> </w:t>
-            </w:r>
-            <w:r>
-              <w:rPr>
-                <w:b/>
-                <w:sz w:val="20"/>
-              </w:rPr>
-              <w:t>the</w:t>
-            </w:r>
-            <w:r>
-              <w:rPr>
-                <w:b/>
-                <w:spacing w:val="-5"/>
-                <w:sz w:val="20"/>
-              </w:rPr>
-              <w:t xml:space="preserve"> {</w:t>
-            </w:r>
-            <w:r>
-              <w:rPr>
-                <w:b/>
-                <w:spacing w:val="-2"/>
-                <w:sz w:val="20"/>
-              </w:rPr>
-              <w:t>class | assignment.}.</w:t>
+          </w:p>
+          <w:p>
+            <w:pPr>
+              <w:pStyle w:val="TableParagraph"/>
+              <w:spacing w:before="40"/>
+              <w:ind w:left="6"/>
+              <w:jc w:val="center"/>
+              <w:rPr>
+                <w:b/>
+                <w:sz w:val="20"/>
+              </w:rPr>
+            </w:pPr>
+            <w:r>
+              <w:rPr>
+                <w:b/>
+                <w:bCs/>
+                <w:sz w:val="20"/>
+              </w:rPr>
+              <w:t>Copying and/or pasting AI responses without modification is considered plagiarism and may lead to disciplinarian actions including expulsion from class.</w:t>
             </w:r>
           </w:p>
         </w:tc>
       </w:tr>
       <w:tr>
         <w:trPr>
-          <w:trHeight w:val="1701"/>
+          <w:trHeight w:val="1087"/>
         </w:trPr>
         <w:tc>
           <w:tcPr>
@@ -1102,9 +768,21 @@
           <w:p>
             <w:pPr>
               <w:pStyle w:val="TableParagraph"/>
-              <w:spacing w:before="161"/>
-              <w:rPr>
-                <w:b/>
+              <w:ind w:left="587" w:hanging="226"/>
+              <w:rPr>
+                <w:b/>
+                <w:spacing w:val="-2"/>
+                <w:sz w:val="20"/>
+              </w:rPr>
+            </w:pPr>
+          </w:p>
+          <w:p>
+            <w:pPr>
+              <w:pStyle w:val="TableParagraph"/>
+              <w:ind w:left="587" w:hanging="226"/>
+              <w:rPr>
+                <w:b/>
+                <w:spacing w:val="-2"/>
                 <w:sz w:val="20"/>
               </w:rPr>
             </w:pPr>
@@ -1283,215 +961,20 @@
           <w:p>
             <w:pPr>
               <w:pStyle w:val="TableParagraph"/>
-              <w:spacing w:before="39" w:line="276" w:lineRule="auto"/>
-              <w:ind w:left="304" w:right="296"/>
+              <w:spacing w:before="170" w:line="276" w:lineRule="auto"/>
+              <w:ind w:left="413" w:right="400" w:hanging="3"/>
               <w:jc w:val="center"/>
               <w:rPr>
-                <w:b/>
-                <w:sz w:val="20"/>
-              </w:rPr>
-            </w:pPr>
-            <w:r>
-              <w:rPr>
-                <w:b/>
-                <w:sz w:val="20"/>
-              </w:rPr>
-              <w:t>AI</w:t>
-            </w:r>
-            <w:r>
-              <w:rPr>
-                <w:b/>
-                <w:spacing w:val="-4"/>
-                <w:sz w:val="20"/>
-              </w:rPr>
-              <w:t xml:space="preserve"> </w:t>
-            </w:r>
-            <w:r>
-              <w:rPr>
-                <w:b/>
-                <w:sz w:val="20"/>
-              </w:rPr>
-              <w:t>can</w:t>
-            </w:r>
-            <w:r>
-              <w:rPr>
-                <w:b/>
-                <w:spacing w:val="-4"/>
-                <w:sz w:val="20"/>
-              </w:rPr>
-              <w:t xml:space="preserve"> </w:t>
-            </w:r>
-            <w:r>
-              <w:rPr>
-                <w:b/>
-                <w:sz w:val="20"/>
-              </w:rPr>
-              <w:t>be</w:t>
-            </w:r>
-            <w:r>
-              <w:rPr>
-                <w:b/>
-                <w:spacing w:val="-4"/>
-                <w:sz w:val="20"/>
-              </w:rPr>
-              <w:t xml:space="preserve"> </w:t>
-            </w:r>
-            <w:r>
-              <w:rPr>
-                <w:b/>
-                <w:sz w:val="20"/>
-              </w:rPr>
-              <w:t>used,</w:t>
-            </w:r>
-            <w:r>
-              <w:rPr>
-                <w:b/>
-                <w:spacing w:val="-4"/>
-                <w:sz w:val="20"/>
-              </w:rPr>
-              <w:t xml:space="preserve"> </w:t>
-            </w:r>
-            <w:r>
-              <w:rPr>
-                <w:b/>
-                <w:sz w:val="20"/>
-              </w:rPr>
-              <w:t>but</w:t>
-            </w:r>
-            <w:r>
-              <w:rPr>
-                <w:b/>
-                <w:spacing w:val="-2"/>
-                <w:sz w:val="20"/>
-              </w:rPr>
-              <w:t xml:space="preserve"> </w:t>
-            </w:r>
-            <w:r>
-              <w:rPr>
-                <w:b/>
-                <w:sz w:val="20"/>
-              </w:rPr>
-              <w:t>your</w:t>
-            </w:r>
-            <w:r>
-              <w:rPr>
-                <w:b/>
-                <w:spacing w:val="-3"/>
-                <w:sz w:val="20"/>
-              </w:rPr>
-              <w:t xml:space="preserve"> </w:t>
-            </w:r>
-            <w:r>
-              <w:rPr>
-                <w:b/>
-                <w:sz w:val="20"/>
-              </w:rPr>
-              <w:t>original</w:t>
-            </w:r>
-            <w:r>
-              <w:rPr>
-                <w:b/>
-                <w:spacing w:val="-4"/>
-                <w:sz w:val="20"/>
-              </w:rPr>
-              <w:t xml:space="preserve"> </w:t>
-            </w:r>
-            <w:r>
-              <w:rPr>
-                <w:b/>
-                <w:sz w:val="20"/>
-              </w:rPr>
-              <w:t>work</w:t>
-            </w:r>
-            <w:r>
-              <w:rPr>
-                <w:b/>
-                <w:spacing w:val="-4"/>
-                <w:sz w:val="20"/>
-              </w:rPr>
-              <w:t xml:space="preserve"> </w:t>
-            </w:r>
-            <w:r>
-              <w:rPr>
-                <w:b/>
-                <w:sz w:val="20"/>
-              </w:rPr>
-              <w:t>with</w:t>
-            </w:r>
-            <w:r>
-              <w:rPr>
-                <w:b/>
-                <w:spacing w:val="-4"/>
-                <w:sz w:val="20"/>
-              </w:rPr>
-              <w:t xml:space="preserve"> </w:t>
-            </w:r>
-            <w:r>
-              <w:rPr>
-                <w:b/>
-                <w:sz w:val="20"/>
-              </w:rPr>
-              <w:t>no</w:t>
-            </w:r>
-            <w:r>
-              <w:rPr>
-                <w:b/>
-                <w:spacing w:val="-4"/>
-                <w:sz w:val="20"/>
-              </w:rPr>
-              <w:t xml:space="preserve"> </w:t>
-            </w:r>
-            <w:r>
-              <w:rPr>
-                <w:b/>
-                <w:sz w:val="20"/>
-              </w:rPr>
-              <w:t>AI</w:t>
-            </w:r>
-            <w:r>
-              <w:rPr>
-                <w:b/>
-                <w:spacing w:val="-4"/>
-                <w:sz w:val="20"/>
-              </w:rPr>
-              <w:t xml:space="preserve"> </w:t>
-            </w:r>
-            <w:r>
-              <w:rPr>
-                <w:b/>
-                <w:sz w:val="20"/>
-              </w:rPr>
-              <w:t>content</w:t>
-            </w:r>
-            <w:r>
-              <w:rPr>
-                <w:b/>
-                <w:spacing w:val="-4"/>
-                <w:sz w:val="20"/>
-              </w:rPr>
-              <w:t xml:space="preserve"> </w:t>
-            </w:r>
-            <w:r>
-              <w:rPr>
-                <w:b/>
-                <w:sz w:val="20"/>
-              </w:rPr>
-              <w:t>must</w:t>
-            </w:r>
-            <w:r>
-              <w:rPr>
-                <w:b/>
-                <w:spacing w:val="-4"/>
-                <w:sz w:val="20"/>
-              </w:rPr>
-              <w:t xml:space="preserve"> </w:t>
-            </w:r>
-            <w:r>
-              <w:rPr>
-                <w:b/>
-                <w:sz w:val="20"/>
-              </w:rPr>
-              <w:t>be provided in an appendix.</w:t>
+                <w:sz w:val="20"/>
+              </w:rPr>
+            </w:pPr>
+            <w:r>
+              <w:rPr>
+                <w:b/>
+                <w:bCs/>
+                <w:sz w:val="20"/>
+              </w:rPr>
+              <w:t>Copying and/or pasting AI responses without modification is considered plagiarism and may lead to disciplinarian actions including expulsion from class.</w:t>
             </w:r>
           </w:p>
         </w:tc>
@@ -1623,7 +1106,31 @@
               <w:rPr>
                 <w:sz w:val="20"/>
               </w:rPr>
-              <w:t>AI is used to complete certain elements of the task, with students</w:t>
+              <w:t xml:space="preserve">AI </w:t>
+            </w:r>
+            <w:r>
+              <w:rPr>
+                <w:sz w:val="20"/>
+              </w:rPr>
+              <w:t>can</w:t>
+            </w:r>
+            <w:r>
+              <w:rPr>
+                <w:sz w:val="20"/>
+              </w:rPr>
+              <w:t xml:space="preserve"> used to complete certain elements of the </w:t>
+            </w:r>
+            <w:r>
+              <w:rPr>
+                <w:sz w:val="20"/>
+              </w:rPr>
+              <w:t>assignment</w:t>
+            </w:r>
+            <w:r>
+              <w:rPr>
+                <w:sz w:val="20"/>
+              </w:rPr>
+              <w:t>, with students</w:t>
             </w:r>
             <w:r>
               <w:rPr>
@@ -1814,17 +1321,12 @@
               </w:rPr>
               <w:t xml:space="preserve"> generated</w:t>
             </w:r>
-          </w:p>
-          <w:p>
-            <w:pPr>
-              <w:pStyle w:val="TableParagraph"/>
-              <w:spacing w:before="1"/>
-              <w:ind w:left="665" w:right="296"/>
-              <w:jc w:val="center"/>
-              <w:rPr>
-                <w:sz w:val="20"/>
-              </w:rPr>
-            </w:pPr>
+            <w:r>
+              <w:rPr>
+                <w:sz w:val="20"/>
+              </w:rPr>
+              <w:t xml:space="preserve"> </w:t>
+            </w:r>
             <w:r>
               <w:rPr>
                 <w:sz w:val="20"/>
@@ -2669,7 +2171,7 @@
 </file>
 
 <file path=word/styles.xml><?xml version="1.0" encoding="utf-8"?>
-<w:styles xmlns:mc="http://schemas.openxmlformats.org/markup-compatibility/2006" xmlns:r="http://schemas.openxmlformats.org/officeDocument/2006/relationships" xmlns:w="http://schemas.openxmlformats.org/wordprocessingml/2006/main" xmlns:w14="http://schemas.microsoft.com/office/word/2010/wordml" xmlns:w15="http://schemas.microsoft.com/office/word/2012/wordml" xmlns:w16cex="http://schemas.microsoft.com/office/word/2018/wordml/cex" xmlns:w16cid="http://schemas.microsoft.com/office/word/2016/wordml/cid" xmlns:w16="http://schemas.microsoft.com/office/word/2018/wordml" xmlns:w16du="http://schemas.microsoft.com/office/word/2023/wordml/word16du" xmlns:w16sdtdh="http://schemas.microsoft.com/office/word/2020/wordml/sdtdatahash" xmlns:w16sdtfl="http://schemas.microsoft.com/office/word/2024/wordml/sdtformatlock" xmlns:w16se="http://schemas.microsoft.com/office/word/2015/wordml/symex" mc:Ignorable="w14 w15 w16se w16cid w16 w16cex w16sdtdh w16sdtfl w16du">
+<w:styles xmlns:mc="http://schemas.openxmlformats.org/markup-compatibility/2006" xmlns:r="http://schemas.openxmlformats.org/officeDocument/2006/relationships" xmlns:w="http://schemas.openxmlformats.org/wordprocessingml/2006/main" xmlns:w14="http://schemas.microsoft.com/office/word/2010/wordml" xmlns:w15="http://schemas.microsoft.com/office/word/2012/wordml" xmlns:w16cex="http://schemas.microsoft.com/office/word/2018/wordml/cex" xmlns:w16cid="http://schemas.microsoft.com/office/word/2016/wordml/cid" xmlns:w16="http://schemas.microsoft.com/office/word/2018/wordml" xmlns:w16sdtdh="http://schemas.microsoft.com/office/word/2020/wordml/sdtdatahash" xmlns:w16se="http://schemas.microsoft.com/office/word/2015/wordml/symex" mc:Ignorable="w14 w15 w16se w16cid w16 w16cex w16sdtdh">
   <w:docDefaults>
     <w:rPrDefault>
       <w:rPr>

</xml_diff>